<commit_message>
HW1 report: drop the abbreviation note, terms live in glossary.md
Remove the abbreviation line under table 1; all terms the report
uses are already in hw1/glossary.md.

Co-Authored-By: Claude Opus 5.5 <noreply@anthropic.com>
</commit_message>
<xml_diff>
--- a/hw1/HW1_report.docx
+++ b/hw1/HW1_report.docx
@@ -1156,45 +1156,6 @@
         </w:tc>
       </w:tr>
     </w:tbl>
-    <w:p>
-      <w:pPr>
-        <w:spacing w:after="120" w:before="80" w:line="280"/>
-        <w:jc w:val="both"/>
-      </w:pPr>
-      <w:r>
-        <w:rPr>
-          <w:rFonts w:ascii="Times New Roman" w:eastAsia="PMingLiU" w:hAnsi="Times New Roman"/>
-          <w:sz w:val="22"/>
-          <w:szCs w:val="22"/>
-        </w:rPr>
-        <w:t xml:space="preserve">表中縮寫：SIFS（Short Interframe Space）、DIFS（DCF Interframe Space）、PLCP（Physical Layer Convergence Procedure）、MCS（Modulation and Coding Scheme）、</w:t>
-      </w:r>
-      <w:r>
-        <w:rPr>
-          <w:rFonts w:ascii="Times New Roman" w:eastAsia="PMingLiU" w:hAnsi="Times New Roman"/>
-          <w:sz w:val="22"/>
-          <w:szCs w:val="22"/>
-        </w:rPr>
-        <w:t xml:space="preserve">CW</w:t>
-      </w:r>
-      <w:r>
-        <w:rPr>
-          <w:rFonts w:ascii="Times New Roman" w:eastAsia="PMingLiU" w:hAnsi="Times New Roman"/>
-          <w:sz w:val="22"/>
-          <w:szCs w:val="22"/>
-          <w:vertAlign w:val="subscript"/>
-        </w:rPr>
-        <w:t xml:space="preserve"/>
-      </w:r>
-      <w:r>
-        <w:rPr>
-          <w:rFonts w:ascii="Times New Roman" w:eastAsia="PMingLiU" w:hAnsi="Times New Roman"/>
-          <w:sz w:val="22"/>
-          <w:szCs w:val="22"/>
-        </w:rPr>
-        <w:t xml:space="preserve">（Contention Window）。</w:t>
-      </w:r>
-    </w:p>
     <w:p>
       <w:pPr>
         <w:spacing w:after="100" w:line="300"/>

</xml_diff>

<commit_message>
HW1 report: fix formatting and order per review
- Merge the duplicated "2" cells in Table 1 (SIFS/DIFS, PLCP Length)
- Move the 實驗環境 paragraph before Table 1 so UDP/MAC are defined first
- Non-breaking spaces between numbers and units; non-breaking hyphen in A-MPDU
- 0.14 ms -> 140 µs in 3.2; full-width colons in the name line
- Swap conclusions 1 and 2 to follow the order of 3.1
- Adopt the revised 實驗環境 wording from the Word edit

Co-Authored-By: Claude Opus 5.5 <noreply@anthropic.com>
</commit_message>
<xml_diff>
--- a/hw1/HW1_report.docx
+++ b/hw1/HW1_report.docx
@@ -29,7 +29,7 @@
           <w:sz w:val="22"/>
           <w:szCs w:val="22"/>
         </w:rPr>
-        <w:t xml:space="preserve">邱勇嘉　　2026 年 10 月 13 日</w:t>
+        <w:t xml:space="preserve">姓名：邱勇嘉　　學號：5115056022</w:t>
       </w:r>
     </w:p>
     <w:p>
@@ -55,6 +55,23 @@
           <w:szCs w:val="22"/>
         </w:rPr>
         <w:t xml:space="preserve">本實驗以 ns-3.49 模擬 IEEE 802.11n 無線區域網路，探討站台（Station, STA）數量、每個 STA 的封包到達率（Arrival Rate, λ），以及 RTS/CTS（Request To Send / Clear To Send）機制對 Throughput 的影響。題目所列 8 項系統參數之設定如表 1。</w:t>
+      </w:r>
+    </w:p>
+    <w:p>
+      <w:pPr>
+        <w:spacing w:after="100" w:line="300"/>
+        <w:jc w:val="both"/>
+      </w:pPr>
+      <w:r>
+        <w:rPr>
+          <w:rFonts w:ascii="Times New Roman" w:eastAsia="PMingLiU" w:hAnsi="Times New Roman"/>
+          <w:sz w:val="22"/>
+          <w:szCs w:val="22"/>
+        </w:rPr>
+        <w:t xml:space="preserve">實驗環境：存取點（Access Point, AP）位於原點，STA 等間距分布於半徑 5 m 的圓上，且所有節點皆位於彼此的載波感測範圍內；流量為由 STA 傳送至 AP 的上行 UDP（User Datagram Protocol）流量，封包到達服從 Poisson 過程。媒介存取控制（Medium Access Control, MAC）採用分散式協調功能（Distributed Coordination Function, DCF，即 CSMA/CA），並啟用 802.11n 預設的 </w:t>
+        <w:t xml:space="preserve">A</w:t>
+        <w:noBreakHyphen/>
+        <w:t xml:space="preserve">MPDU（Aggregate MAC Protocol Data Unit）聚合機制。實驗組合為 STA 數（2 種）× λ（2 種）× RTS/CTS 開啟與否（2 種），共 8 組，每組以 3 個 seed 執行後取平均，模擬自 1 s 起開始送出封包，並以 2–20 s 作為量測區間。</w:t>
       </w:r>
     </w:p>
     <w:p>
@@ -300,7 +317,7 @@
                 <w:sz w:val="20"/>
                 <w:szCs w:val="20"/>
               </w:rPr>
-              <w:t xml:space="preserve">20 MHz（5 GHz，通道 36）</w:t>
+              <w:t xml:space="preserve">20 MHz（5 GHz，通道 36）</w:t>
             </w:r>
           </w:p>
         </w:tc>
@@ -313,6 +330,7 @@
         <w:tc>
           <w:tcPr>
             <w:tcW w:type="dxa" w:w="560"/>
+            <w:vMerge w:val="restart"/>
             <w:tcBorders>
               <w:top w:val="single" w:color="808080" w:sz="4"/>
               <w:left w:val="single" w:color="808080" w:sz="4"/>
@@ -402,7 +420,7 @@
                 <w:sz w:val="20"/>
                 <w:szCs w:val="20"/>
               </w:rPr>
-              <w:t xml:space="preserve">SIFS = 16 µs，slot = 9 µs；DIFS = SIFS + 2 × slot = 34 µs（題目未給數值，依講義 p.22）</w:t>
+              <w:t xml:space="preserve">SIFS = 16 µs，slot = 9 µs；DIFS = SIFS + 2 × slot = 34 µs（題目未給數值，依講義 p.22）</w:t>
             </w:r>
           </w:p>
         </w:tc>
@@ -415,34 +433,15 @@
         <w:tc>
           <w:tcPr>
             <w:tcW w:type="dxa" w:w="560"/>
-            <w:tcBorders>
-              <w:top w:val="single" w:color="808080" w:sz="4"/>
-              <w:left w:val="single" w:color="808080" w:sz="4"/>
-              <w:bottom w:val="single" w:color="808080" w:sz="4"/>
-              <w:right w:val="single" w:color="808080" w:sz="4"/>
-            </w:tcBorders>
-            <w:tcMar>
-              <w:top w:type="dxa" w:w="50"/>
-              <w:left w:type="dxa" w:w="90"/>
-              <w:bottom w:type="dxa" w:w="50"/>
-              <w:right w:type="dxa" w:w="90"/>
-            </w:tcMar>
-            <w:vAlign w:val="center"/>
-          </w:tcPr>
-          <w:p>
-            <w:pPr>
-              <w:spacing w:line="260"/>
-              <w:jc w:val="center"/>
-            </w:pPr>
-            <w:r>
-              <w:rPr>
-                <w:rFonts w:ascii="Times New Roman" w:eastAsia="PMingLiU" w:hAnsi="Times New Roman"/>
-                <w:sz w:val="20"/>
-                <w:szCs w:val="20"/>
-              </w:rPr>
-              <w:t xml:space="preserve">2</w:t>
-            </w:r>
-          </w:p>
+            <w:vMerge w:val="continue"/>
+            <w:tcBorders>
+              <w:top w:val="single" w:color="808080" w:sz="4"/>
+              <w:left w:val="single" w:color="808080" w:sz="4"/>
+              <w:bottom w:val="single" w:color="808080" w:sz="4"/>
+              <w:right w:val="single" w:color="808080" w:sz="4"/>
+            </w:tcBorders>
+          </w:tcPr>
+          <w:p/>
         </w:tc>
         <w:tc>
           <w:tcPr>
@@ -504,7 +503,7 @@
                 <w:sz w:val="20"/>
                 <w:szCs w:val="20"/>
               </w:rPr>
-              <w:t xml:space="preserve">36 µs（802.11n HT-mixed 前導：L-STF 8 + L-LTF 8 + L-SIG 4 + HT-SIG 8 + HT-STF 4 + HT-LTF 4 µs）</w:t>
+              <w:t xml:space="preserve">36 µs（802.11n HT-mixed 前導：L-STF 8 + L-LTF 8 + L-SIG 4 + HT-SIG 8 + HT-STF 4 + HT-LTF 4 µs）</w:t>
             </w:r>
           </w:p>
         </w:tc>
@@ -606,7 +605,7 @@
                 <w:sz w:val="20"/>
                 <w:szCs w:val="20"/>
               </w:rPr>
-              <w:t xml:space="preserve">資料 HtMcs7（64-QAM 5/6，65 Mbps）；RTS 為 HtMcs0；ACK、CTS 為 OFDM 6 Mbps；Block Ack 為 OFDM 24 Mbps</w:t>
+              <w:t xml:space="preserve">資料 HtMcs7（64-QAM 5/6，65 Mbps）；RTS 為 HtMcs0；ACK、CTS 為 OFDM 6 Mbps；Block Ack 為 OFDM 24 Mbps</w:t>
             </w:r>
           </w:p>
         </w:tc>
@@ -844,7 +843,7 @@
                 <w:sz w:val="20"/>
                 <w:szCs w:val="20"/>
               </w:rPr>
-              <w:t xml:space="preserve">UDP payload 1472 B（MAC 訊框 1538 B，空中時間 228 µs）</w:t>
+              <w:t xml:space="preserve">UDP payload 1472 B（MAC 訊框 1538 B，空中時間 228 µs）</w:t>
             </w:r>
           </w:p>
         </w:tc>
@@ -1048,7 +1047,7 @@
                 <w:sz w:val="20"/>
                 <w:szCs w:val="20"/>
               </w:rPr>
-              <w:t xml:space="preserve">200、800 packets/s（變數）</w:t>
+              <w:t xml:space="preserve">200、800 packets/s（變數）</w:t>
             </w:r>
           </w:p>
         </w:tc>
@@ -1158,20 +1157,6 @@
     </w:tbl>
     <w:p>
       <w:pPr>
-        <w:spacing w:after="100" w:line="300"/>
-        <w:jc w:val="both"/>
-      </w:pPr>
-      <w:r>
-        <w:rPr>
-          <w:rFonts w:ascii="Times New Roman" w:eastAsia="PMingLiU" w:hAnsi="Times New Roman"/>
-          <w:sz w:val="22"/>
-          <w:szCs w:val="22"/>
-        </w:rPr>
-        <w:t xml:space="preserve">實驗環境：存取點（Access Point, AP）位於原點，STA 平均分布於半徑 5 m 的圓上，所有節點彼此皆可偵聽。流量為上行 UDP（User Datagram Protocol，STA → AP），封包到達服從 Poisson 分布。媒介存取控制（Medium Access Control, MAC）採分散式協調功能（Distributed Coordination Function, DCF，即 CSMA/CA），並啟用 802.11n 預設的 A-MPDU（Aggregate MAC Protocol Data Unit）聚合。實驗組合為 STA 數 2 種 × λ 2 種 × RTS/CTS 開關 2 種，共 8 組，每組以 3 個 seed 執行後取平均；模擬於 1 s 開始送出封包，量測區間為 2–20 s。</w:t>
-      </w:r>
-    </w:p>
-    <w:p>
-      <w:pPr>
         <w:pStyle w:val="Heading1"/>
       </w:pPr>
       <w:r>
@@ -1192,7 +1177,7 @@
           <w:sz w:val="22"/>
           <w:szCs w:val="22"/>
         </w:rPr>
-        <w:t xml:space="preserve">Throughput 定義為 AP 在 2–20 s 收到的 UDP payload 位元數 ÷ 18 s；Offered Load = STA 數 × λ × 1472 B × 8。各組結果如圖 1 與表 2，圖中虛線為 Offered Load，誤差棒為 3 個 seed 的標準差（皆在 0.5 Mbps 以內）。</w:t>
+        <w:t xml:space="preserve">Throughput 定義為 AP 在 2–20 s 收到的 UDP payload 位元數 ÷ 18 s；Offered Load = STA 數 × λ × 1472 B × 8。各組結果如圖 1 與表 2，圖中虛線為 Offered Load，誤差棒為 3 個 seed 的標準差（皆在 0.5 Mbps 以內）。</w:t>
       </w:r>
     </w:p>
     <w:p>
@@ -2852,7 +2837,7 @@
           <w:sz w:val="22"/>
           <w:szCs w:val="22"/>
         </w:rPr>
-        <w:t xml:space="preserve">5 STA 時 Throughput 等於 Offered Load，表示尚未飽和，封包到達後僅需等待 DIFS（34 µs）與平均 7.5 個 slot 的退避時間（</w:t>
+        <w:t xml:space="preserve">5 STA 時 Throughput 等於 Offered Load，表示尚未飽和，封包到達後僅需等待 DIFS（34 µs）與平均 7.5 個 slot 的退避時間（</w:t>
       </w:r>
       <w:r>
         <w:rPr>
@@ -2877,7 +2862,7 @@
           <w:sz w:val="22"/>
           <w:szCs w:val="22"/>
         </w:rPr>
-        <w:t xml:space="preserve"> 15 之半 × 9 µs ≈ 68 µs）即可送出。</w:t>
+        <w:t xml:space="preserve"> 15 之半 × 9 µs ≈ 68 µs）即可送出。</w:t>
       </w:r>
     </w:p>
     <w:p>
@@ -2891,7 +2876,10 @@
           <w:sz w:val="22"/>
           <w:szCs w:val="22"/>
         </w:rPr>
-        <w:t xml:space="preserve">20 STA 則已飽和：λ 由 200 增至 800 packets/s，Offered Load 增為 4 倍，Throughput 僅由 33.6 增至 35.6 Mbps，超出 MAC 傳輸能力的封包在佇列中被丟棄。飽和值遠低於實體層（Physical layer, PHY）速率 65 Mbps，原因有二：其一為每次傳輸的固定開銷，包括 DIFS 34 µs、平均退避約 68 µs、PLCP 前導 36 µs、SIFS 16 µs 與 Block Ack 32 µs，合計約 186 µs；其二為碰撞浪費的時間。A-MPDU 將多個封包合併為一次傳輸，可分攤固定開銷，但無法消除碰撞。</w:t>
+        <w:t xml:space="preserve">20 STA 則已飽和：λ 由 200 增至 800 packets/s，Offered Load 增為 4 倍，Throughput 僅由 33.6 增至 35.6 Mbps，超出 MAC 傳輸能力的封包在佇列中被丟棄。飽和值遠低於實體層（Physical layer, PHY）速率 65 Mbps，原因有二：其一為每次傳輸的固定開銷，包括 DIFS 34 µs、平均退避約 68 µs、PLCP 前導 36 µs、SIFS 16 µs 與 Block Ack 32 µs，合計約 186 µs；其二為碰撞浪費的時間。</w:t>
+        <w:t xml:space="preserve">A</w:t>
+        <w:noBreakHyphen/>
+        <w:t xml:space="preserve">MPDU 將多個封包合併為一次傳輸，可分攤固定開銷，但無法消除碰撞。</w:t>
       </w:r>
     </w:p>
     <w:p>
@@ -2905,7 +2893,7 @@
           <w:sz w:val="22"/>
           <w:szCs w:val="22"/>
         </w:rPr>
-        <w:t xml:space="preserve">在相同 Offered Load（47.1 Mbps）下，5 STA × 800 packets/s 與 20 STA × 200 packets/s 於 RTS/CTS 關閉時分別為 46.5 與 33.6 Mbps，差異來自競爭程度而非負載。DCF 中各 STA 首次退避自 [0, </w:t>
+        <w:t xml:space="preserve">在相同 Offered Load（47.1 Mbps）下，5 STA × 800 packets/s 與 20 STA × 200 packets/s 於 RTS/CTS 關閉時分別為 46.5 與 33.6 Mbps，差異來自競爭程度而非負載。DCF 中各 STA 首次退避自 [0, </w:t>
       </w:r>
       <w:r>
         <w:rPr>
@@ -2964,7 +2952,10 @@
           <w:sz w:val="22"/>
           <w:szCs w:val="22"/>
         </w:rPr>
-        <w:t xml:space="preserve"> 約為整個 A-MPDU 的傳輸時間加上 DIFS；碰撞後 CW 依序加倍為 31、63⋯（上限 1023），退避的閒置時間亦隨之增加。</w:t>
+        <w:t xml:space="preserve"> 約為整個 </w:t>
+        <w:t xml:space="preserve">A</w:t>
+        <w:noBreakHyphen/>
+        <w:t xml:space="preserve">MPDU 的傳輸時間加上 DIFS；碰撞後 CW 依序加倍為 31、63⋯（上限 1023），退避的閒置時間亦隨之增加。</w:t>
       </w:r>
     </w:p>
     <w:p>
@@ -2989,7 +2980,7 @@
           <w:sz w:val="22"/>
           <w:szCs w:val="22"/>
         </w:rPr>
-        <w:t xml:space="preserve">20 STA 時開啟 RTS/CTS，Throughput 於 λ = 200 與 800 packets/s 分別提升約 36% 與 64%；5 STA 開啟與否差異不大。</w:t>
+        <w:t xml:space="preserve">20 STA 時開啟 RTS/CTS，Throughput 於 λ = 200 與 800 packets/s 分別提升約 36% 與 64%；5 STA 開啟與否差異不大。</w:t>
       </w:r>
     </w:p>
     <w:p>
@@ -3020,7 +3011,10 @@
           <w:sz w:val="22"/>
           <w:szCs w:val="22"/>
         </w:rPr>
-        <w:t xml:space="preserve"> 的縮短。RTS/CTS 關閉時，碰撞會浪費整個 A-MPDU 的傳輸時間（最長可達數 ms）；開啟後碰撞僅發生於 RTS，T</w:t>
+        <w:t xml:space="preserve"> 的縮短。RTS/CTS 關閉時，碰撞會浪費整個 </w:t>
+        <w:t xml:space="preserve">A</w:t>
+        <w:noBreakHyphen/>
+        <w:t xml:space="preserve">MPDU 的傳輸時間（最長可達數 ms）；開啟後碰撞僅發生於 RTS，T</w:t>
       </w:r>
       <w:r>
         <w:rPr>
@@ -3037,7 +3031,7 @@
           <w:sz w:val="22"/>
           <w:szCs w:val="22"/>
         </w:rPr>
-        <w:t xml:space="preserve"> 僅為 RTS、等待 CTS 逾時與 DIFS 之和，約 0.14 ms。CTS 回覆後，其他 STA 依網路配置向量（Network Allocation Vector, NAV）延後存取，後續的資料訊框不會遭受碰撞。其代價為每次成功傳輸額外增加 RTS 64 + CTS 44 + 2 × SIFS 16 = 140 µs；在 20 STA 的高競爭情境下，此成本遠小於節省的碰撞時間。</w:t>
+        <w:t xml:space="preserve"> 僅為 RTS、等待 CTS 逾時與 DIFS 之和，約 140 µs。CTS 回覆後，其他 STA 依網路配置向量（Network Allocation Vector, NAV）延後存取，後續的資料訊框不會遭受碰撞。其代價為每次成功傳輸額外增加 RTS 64 + CTS 44 + 2 × SIFS 16 = 140 µs；在 20 STA 的高競爭情境下，此成本遠小於節省的碰撞時間。</w:t>
       </w:r>
     </w:p>
     <w:p>
@@ -3069,7 +3063,7 @@
           <w:sz w:val="22"/>
           <w:szCs w:val="22"/>
         </w:rPr>
-        <w:t xml:space="preserve">STA 數量與競爭：</w:t>
+        <w:t xml:space="preserve">Arrival Rate 與飽和：</w:t>
       </w:r>
       <w:r>
         <w:rPr>
@@ -3077,7 +3071,7 @@
           <w:sz w:val="22"/>
           <w:szCs w:val="22"/>
         </w:rPr>
-        <w:t xml:space="preserve">STA 越多，碰撞機率越高。相同 Offered Load 47.1 Mbps 下，20 STA 僅達 33.6 Mbps，5 STA 則為 46.5 Mbps。</w:t>
+        <w:t xml:space="preserve">未飽和時 Throughput 等於 Offered Load；飽和後不再隨 λ 上升，20 STA 由 200 增至 800 packets/s 時 Throughput 僅增加 2 Mbps。</w:t>
       </w:r>
     </w:p>
     <w:p>
@@ -3098,7 +3092,7 @@
           <w:sz w:val="22"/>
           <w:szCs w:val="22"/>
         </w:rPr>
-        <w:t xml:space="preserve">Arrival Rate 與飽和：</w:t>
+        <w:t xml:space="preserve">STA 數量與競爭：</w:t>
       </w:r>
       <w:r>
         <w:rPr>
@@ -3106,7 +3100,7 @@
           <w:sz w:val="22"/>
           <w:szCs w:val="22"/>
         </w:rPr>
-        <w:t xml:space="preserve">未飽和時 Throughput 等於 Offered Load；飽和後不再隨 λ 上升，20 STA 由 200 增至 800 packets/s 時 Throughput 僅增加 2 Mbps。</w:t>
+        <w:t xml:space="preserve">STA 越多，碰撞機率越高。相同 Offered Load 47.1 Mbps 下，20 STA 僅達 33.6 Mbps，5 STA 則為 46.5 Mbps。</w:t>
       </w:r>
     </w:p>
     <w:p>

</xml_diff>